<commit_message>
feat: mapa A3 a escala, proyecto QGIS con shapefiles (zip para el equipo) y planteamiento en una sola columna
Co-Authored-By: Claude Opus 5.5 <noreply@anthropic.com>
</commit_message>
<xml_diff>
--- a/docs/informe_muestreo.docx
+++ b/docs/informe_muestreo.docx
@@ -3213,7 +3213,7 @@
           <w:b w:val="0"/>
           <w:i w:val="0"/>
         </w:rPr>
-        <w:t>En la composición de QGIS el marco del mapa mide 264 mm de ancho y muestra los 360° de longitud. Sobre el ecuador, 360° son 40 075 km = 40 075 000 000 mm, así que:</w:t>
+        <w:t>El mapa muestra los 360° de longitud. Sobre el ecuador, 360° son 40 075 km = 40 075 000 000 mm. La escala es esa distancia dividida para el ancho del marco del mapa en el papel. Hay dos versiones de la lámina, la A3 es la A4 ampliada:</w:t>
       </w:r>
     </w:p>
     <w:tbl>
@@ -3240,7 +3240,19 @@
                 <w:rFonts w:ascii="Consolas" w:hAnsi="Consolas"/>
                 <w:sz w:val="17"/>
               </w:rPr>
-              <w:t>escala = 40 075 000 000 mm / 264 mm ≈ 151 800 000   →   1 : 150 000 000</w:t>
+              <w:t>A4: marco de 264 mm   →   40 075 000 000 / 264   ≈ 151 800 000   →   1 : 151 000 000</w:t>
+            </w:r>
+          </w:p>
+          <w:p>
+            <w:pPr>
+              <w:spacing w:after="0" w:line="240" w:lineRule="auto"/>
+            </w:pPr>
+            <w:r>
+              <w:rPr>
+                <w:rFonts w:ascii="Consolas" w:hAnsi="Consolas"/>
+                <w:sz w:val="17"/>
+              </w:rPr>
+              <w:t>A3: marco de 373 mm   →   40 075 000 000 / 373,4 ≈ 107 300 000   →   1 : 107 000 000</w:t>
             </w:r>
           </w:p>
         </w:tc>
@@ -3271,8 +3283,349 @@
           <w:b w:val="0"/>
           <w:i w:val="0"/>
         </w:rPr>
-        <w:t>: en un mapa mundial las distancias se deforman hacia los polos, por eso el membrete y la escala gráfica lo aclaran. La barra de 2 500 km debe medir unos 16,5 mm.</w:t>
+        <w:t>: en un mapa mundial las distancias se deforman hacia los polos, por eso el membrete y la escala gráfica lo aclaran.</w:t>
       </w:r>
+    </w:p>
+    <w:tbl>
+      <w:tblPr>
+        <w:tblStyle w:val="TableGrid"/>
+        <w:tblW w:type="auto" w:w="0"/>
+        <w:jc w:val="center"/>
+        <w:tblLook w:firstColumn="1" w:firstRow="1" w:lastColumn="0" w:lastRow="0" w:noHBand="0" w:noVBand="1" w:val="04A0"/>
+      </w:tblPr>
+      <w:tblGrid>
+        <w:gridCol w:w="3099"/>
+        <w:gridCol w:w="3099"/>
+        <w:gridCol w:w="3099"/>
+      </w:tblGrid>
+      <w:tr>
+        <w:tc>
+          <w:tcPr>
+            <w:tcW w:type="dxa" w:w="3402"/>
+            <w:shd w:val="clear" w:color="auto" w:fill="E8F0FB"/>
+          </w:tcPr>
+          <w:p>
+            <w:pPr>
+              <w:spacing w:after="0"/>
+            </w:pPr>
+            <w:r/>
+            <w:r>
+              <w:rPr>
+                <w:b/>
+                <w:sz w:val="18"/>
+              </w:rPr>
+            </w:r>
+          </w:p>
+        </w:tc>
+        <w:tc>
+          <w:tcPr>
+            <w:tcW w:type="dxa" w:w="2835"/>
+            <w:shd w:val="clear" w:color="auto" w:fill="E8F0FB"/>
+          </w:tcPr>
+          <w:p>
+            <w:pPr>
+              <w:spacing w:after="0"/>
+            </w:pPr>
+            <w:r/>
+            <w:r>
+              <w:rPr>
+                <w:b/>
+                <w:sz w:val="18"/>
+              </w:rPr>
+              <w:t>A4</w:t>
+            </w:r>
+          </w:p>
+        </w:tc>
+        <w:tc>
+          <w:tcPr>
+            <w:tcW w:type="dxa" w:w="2835"/>
+            <w:shd w:val="clear" w:color="auto" w:fill="E8F0FB"/>
+          </w:tcPr>
+          <w:p>
+            <w:pPr>
+              <w:spacing w:after="0"/>
+            </w:pPr>
+            <w:r/>
+            <w:r>
+              <w:rPr>
+                <w:b/>
+                <w:sz w:val="18"/>
+              </w:rPr>
+              <w:t>A3</w:t>
+            </w:r>
+          </w:p>
+        </w:tc>
+      </w:tr>
+      <w:tr>
+        <w:tc>
+          <w:tcPr>
+            <w:tcW w:type="dxa" w:w="3402"/>
+          </w:tcPr>
+          <w:p>
+            <w:pPr>
+              <w:spacing w:after="0"/>
+            </w:pPr>
+            <w:r/>
+            <w:r>
+              <w:rPr>
+                <w:sz w:val="18"/>
+              </w:rPr>
+              <w:t>Archivo</w:t>
+            </w:r>
+          </w:p>
+        </w:tc>
+        <w:tc>
+          <w:tcPr>
+            <w:tcW w:type="dxa" w:w="2835"/>
+          </w:tcPr>
+          <w:p>
+            <w:pPr>
+              <w:spacing w:after="0"/>
+            </w:pPr>
+            <w:r/>
+            <w:r>
+              <w:rPr>
+                <w:sz w:val="18"/>
+              </w:rPr>
+              <w:t>docs/mapa_ubicacion_A4.pdf</w:t>
+            </w:r>
+          </w:p>
+        </w:tc>
+        <w:tc>
+          <w:tcPr>
+            <w:tcW w:type="dxa" w:w="2835"/>
+          </w:tcPr>
+          <w:p>
+            <w:pPr>
+              <w:spacing w:after="0"/>
+            </w:pPr>
+            <w:r/>
+            <w:r>
+              <w:rPr>
+                <w:sz w:val="18"/>
+              </w:rPr>
+              <w:t>docs/mapa_ubicacion_A3.pdf</w:t>
+            </w:r>
+          </w:p>
+        </w:tc>
+      </w:tr>
+      <w:tr>
+        <w:tc>
+          <w:tcPr>
+            <w:tcW w:type="dxa" w:w="3402"/>
+          </w:tcPr>
+          <w:p>
+            <w:pPr>
+              <w:spacing w:after="0"/>
+            </w:pPr>
+            <w:r/>
+            <w:r>
+              <w:rPr>
+                <w:sz w:val="18"/>
+              </w:rPr>
+              <w:t>Tamaño de la hoja</w:t>
+            </w:r>
+          </w:p>
+        </w:tc>
+        <w:tc>
+          <w:tcPr>
+            <w:tcW w:type="dxa" w:w="2835"/>
+          </w:tcPr>
+          <w:p>
+            <w:pPr>
+              <w:spacing w:after="0"/>
+            </w:pPr>
+            <w:r/>
+            <w:r>
+              <w:rPr>
+                <w:sz w:val="18"/>
+              </w:rPr>
+              <w:t>297 × 210 mm</w:t>
+            </w:r>
+          </w:p>
+        </w:tc>
+        <w:tc>
+          <w:tcPr>
+            <w:tcW w:type="dxa" w:w="2835"/>
+          </w:tcPr>
+          <w:p>
+            <w:pPr>
+              <w:spacing w:after="0"/>
+            </w:pPr>
+            <w:r/>
+            <w:r>
+              <w:rPr>
+                <w:sz w:val="18"/>
+              </w:rPr>
+              <w:t>420 × 297 mm</w:t>
+            </w:r>
+          </w:p>
+        </w:tc>
+      </w:tr>
+      <w:tr>
+        <w:tc>
+          <w:tcPr>
+            <w:tcW w:type="dxa" w:w="3402"/>
+          </w:tcPr>
+          <w:p>
+            <w:pPr>
+              <w:spacing w:after="0"/>
+            </w:pPr>
+            <w:r/>
+            <w:r>
+              <w:rPr>
+                <w:sz w:val="18"/>
+              </w:rPr>
+              <w:t>Escala</w:t>
+            </w:r>
+          </w:p>
+        </w:tc>
+        <w:tc>
+          <w:tcPr>
+            <w:tcW w:type="dxa" w:w="2835"/>
+          </w:tcPr>
+          <w:p>
+            <w:pPr>
+              <w:spacing w:after="0"/>
+            </w:pPr>
+            <w:r/>
+            <w:r>
+              <w:rPr>
+                <w:sz w:val="18"/>
+              </w:rPr>
+              <w:t>1 : 151 000 000</w:t>
+            </w:r>
+          </w:p>
+        </w:tc>
+        <w:tc>
+          <w:tcPr>
+            <w:tcW w:type="dxa" w:w="2835"/>
+          </w:tcPr>
+          <w:p>
+            <w:pPr>
+              <w:spacing w:after="0"/>
+            </w:pPr>
+            <w:r/>
+            <w:r>
+              <w:rPr>
+                <w:sz w:val="18"/>
+              </w:rPr>
+              <w:t>1 : 107 000 000</w:t>
+            </w:r>
+          </w:p>
+        </w:tc>
+      </w:tr>
+      <w:tr>
+        <w:tc>
+          <w:tcPr>
+            <w:tcW w:type="dxa" w:w="3402"/>
+          </w:tcPr>
+          <w:p>
+            <w:pPr>
+              <w:spacing w:after="0"/>
+            </w:pPr>
+            <w:r/>
+            <w:r>
+              <w:rPr>
+                <w:sz w:val="18"/>
+              </w:rPr>
+              <w:t>Ancho del marco del mapa (regla)</w:t>
+            </w:r>
+          </w:p>
+        </w:tc>
+        <w:tc>
+          <w:tcPr>
+            <w:tcW w:type="dxa" w:w="2835"/>
+          </w:tcPr>
+          <w:p>
+            <w:pPr>
+              <w:spacing w:after="0"/>
+            </w:pPr>
+            <w:r/>
+            <w:r>
+              <w:rPr>
+                <w:sz w:val="18"/>
+              </w:rPr>
+              <w:t>26,4 cm</w:t>
+            </w:r>
+          </w:p>
+        </w:tc>
+        <w:tc>
+          <w:tcPr>
+            <w:tcW w:type="dxa" w:w="2835"/>
+          </w:tcPr>
+          <w:p>
+            <w:pPr>
+              <w:spacing w:after="0"/>
+            </w:pPr>
+            <w:r/>
+            <w:r>
+              <w:rPr>
+                <w:sz w:val="18"/>
+              </w:rPr>
+              <w:t>37,3 cm</w:t>
+            </w:r>
+          </w:p>
+        </w:tc>
+      </w:tr>
+      <w:tr>
+        <w:tc>
+          <w:tcPr>
+            <w:tcW w:type="dxa" w:w="3402"/>
+          </w:tcPr>
+          <w:p>
+            <w:pPr>
+              <w:spacing w:after="0"/>
+            </w:pPr>
+            <w:r/>
+            <w:r>
+              <w:rPr>
+                <w:sz w:val="18"/>
+              </w:rPr>
+              <w:t>Barra de 2 500 km (regla)</w:t>
+            </w:r>
+          </w:p>
+        </w:tc>
+        <w:tc>
+          <w:tcPr>
+            <w:tcW w:type="dxa" w:w="2835"/>
+          </w:tcPr>
+          <w:p>
+            <w:pPr>
+              <w:spacing w:after="0"/>
+            </w:pPr>
+            <w:r/>
+            <w:r>
+              <w:rPr>
+                <w:sz w:val="18"/>
+              </w:rPr>
+              <w:t>≈ 1,6 cm</w:t>
+            </w:r>
+          </w:p>
+        </w:tc>
+        <w:tc>
+          <w:tcPr>
+            <w:tcW w:type="dxa" w:w="2835"/>
+          </w:tcPr>
+          <w:p>
+            <w:pPr>
+              <w:spacing w:after="0"/>
+            </w:pPr>
+            <w:r/>
+            <w:r>
+              <w:rPr>
+                <w:sz w:val="18"/>
+              </w:rPr>
+              <w:t>≈ 2,3 cm</w:t>
+            </w:r>
+          </w:p>
+        </w:tc>
+      </w:tr>
+    </w:tbl>
+    <w:p>
+      <w:pPr>
+        <w:spacing w:after="40"/>
+      </w:pPr>
     </w:p>
     <w:p>
       <w:r>
@@ -3292,7 +3645,7 @@
           <w:b w:val="0"/>
           <w:i w:val="0"/>
         </w:rPr>
-        <w:t>Archivo: docs/mapa_ubicacion_A4.pdf (en la web, sección Mapa de ubicación → «Mapa A4 en PDF para imprimir»). Es vectorial y mide exactamente 297 × 210 mm.</w:t>
+        <w:t>Descargar el PDF del tamaño de papel que se va a usar (en la web: sección Mapa de ubicación o página Datos). Son vectoriales y miden exactamente el tamaño de la hoja.</w:t>
       </w:r>
     </w:p>
     <w:p>
@@ -3304,7 +3657,7 @@
           <w:b w:val="0"/>
           <w:i w:val="0"/>
         </w:rPr>
-        <w:t>Papel A4, orientación horizontal.</w:t>
+        <w:t>Papel del mismo tamaño que el PDF (A3 para el A3), orientación horizontal, a color.</w:t>
       </w:r>
     </w:p>
     <w:p>
@@ -3316,7 +3669,7 @@
           <w:b w:val="0"/>
           <w:i w:val="0"/>
         </w:rPr>
-        <w:t>En el diálogo de impresión elegir «Tamaño real» o «Escala 100 %». NO usar «Ajustar a la página», «Ajustar al área imprimible» ni «Reducir páginas grandes»: cambian el tamaño y la escala deja de valer.</w:t>
+        <w:t>En el diálogo de impresión elegir «Tamaño real» o «Escala 100 %». NO usar «Ajustar a la página», «Ajustar al área imprimible» ni «Reducir páginas grandes»: cambian el tamaño y la escala deja de valer. No imprimir el PDF A4 en hoja A3 «ampliado»: para eso está el PDF A3.</w:t>
       </w:r>
     </w:p>
     <w:p>
@@ -3328,7 +3681,7 @@
           <w:b w:val="0"/>
           <w:i w:val="0"/>
         </w:rPr>
-        <w:t>Imprimir en color (la leyenda distingue los ambientes por color).</w:t>
+        <w:t>Verificar con una regla el ancho del marco y la barra de escala (tabla de arriba). Si da distinto, la impresora escaló la hoja.</w:t>
       </w:r>
     </w:p>
     <w:p>
@@ -3340,19 +3693,7 @@
           <w:b w:val="0"/>
           <w:i w:val="0"/>
         </w:rPr>
-        <w:t>Verificar con una regla: el marco del mapa (sin las coordenadas) debe medir 26,4 cm de ancho y la barra de 2 500 km unos 1,6 cm. Si da distinto, la impresora escaló la hoja.</w:t>
-      </w:r>
-    </w:p>
-    <w:p>
-      <w:pPr>
-        <w:pStyle w:val="ListNumber"/>
-      </w:pPr>
-      <w:r>
-        <w:rPr>
-          <w:b w:val="0"/>
-          <w:i w:val="0"/>
-        </w:rPr>
-        <w:t>Desde QGIS también se puede: abrir data/gis/mapa_ubicacion.qgz, Proyecto → Diseños → «Mapa de ubicación A4» y Diseño → Imprimir (o Exportar como PDF), con la página al 100 %.</w:t>
+        <w:t>Desde QGIS también se puede: abrir mapa_ubicacion.qgz (del .zip de la web), Proyecto → Diseños → «Mapa de ubicación A3» (o A4) y Diseño → Imprimir o Exportar como PDF, con la página al 100 %.</w:t>
       </w:r>
     </w:p>
     <w:p>

</xml_diff>

<commit_message>
fix: escalas redondas del mapa (A4 1:150 M, A3 1:110 M) y planteamiento como una sola redacción
Co-Authored-By: Claude Opus 5.5 <noreply@anthropic.com>
</commit_message>
<xml_diff>
--- a/docs/informe_muestreo.docx
+++ b/docs/informe_muestreo.docx
@@ -3213,7 +3213,7 @@
           <w:b w:val="0"/>
           <w:i w:val="0"/>
         </w:rPr>
-        <w:t>El mapa muestra los 360° de longitud. Sobre el ecuador, 360° son 40 075 km = 40 075 000 000 mm. La escala es esa distancia dividida para el ancho del marco del mapa en el papel. Hay dos versiones de la lámina, la A3 es la A4 ampliada:</w:t>
+        <w:t>Escala = distancia en el papel / distancia real. Aquí se hizo al revés: se eligió una escala redonda y se calculó cuánto debe medir el marco del mapa para que los 360° de longitud entren a esa escala. QGIS mide la escala con la longitud de un grado de latitud (unos 110,6 km), así que 360° equivalen a unos 39 810 km = 39 810 000 000 mm:</w:t>
       </w:r>
     </w:p>
     <w:tbl>
@@ -3240,7 +3240,7 @@
                 <w:rFonts w:ascii="Consolas" w:hAnsi="Consolas"/>
                 <w:sz w:val="17"/>
               </w:rPr>
-              <w:t>A4: marco de 264 mm   →   40 075 000 000 / 264   ≈ 151 800 000   →   1 : 151 000 000</w:t>
+              <w:t>A4: ancho del marco = 39 810 000 000 mm / 150 000 000 ≈ 265,4 mm   →   1 : 150 000 000</w:t>
             </w:r>
           </w:p>
           <w:p>
@@ -3252,7 +3252,7 @@
                 <w:rFonts w:ascii="Consolas" w:hAnsi="Consolas"/>
                 <w:sz w:val="17"/>
               </w:rPr>
-              <w:t>A3: marco de 373 mm   →   40 075 000 000 / 373,4 ≈ 107 300 000   →   1 : 107 000 000</w:t>
+              <w:t>A3: ancho del marco = 39 810 000 000 mm / 110 000 000 ≈ 361,9 mm   →   1 : 110 000 000</w:t>
             </w:r>
           </w:p>
         </w:tc>
@@ -3262,6 +3262,15 @@
       <w:pPr>
         <w:spacing w:after="40"/>
       </w:pPr>
+    </w:p>
+    <w:p>
+      <w:r>
+        <w:rPr>
+          <w:b w:val="0"/>
+          <w:i w:val="0"/>
+        </w:rPr>
+        <w:t>¿Por qué no 1 : 100 000 000 en A3? Porque el marco mediría unos 40 cm en una hoja de 42 cm y no quedaría lugar para el borde ni las coordenadas. Sobre el ecuador el grado de longitud mide un poco más (111,3 km), así que allí la escala real es 0,7 % menor (1 : 151 000 000 en A4); con una regla no se nota.</w:t>
+      </w:r>
     </w:p>
     <w:p>
       <w:r>
@@ -3493,7 +3502,7 @@
               <w:rPr>
                 <w:sz w:val="18"/>
               </w:rPr>
-              <w:t>1 : 151 000 000</w:t>
+              <w:t>1 : 150 000 000</w:t>
             </w:r>
           </w:p>
         </w:tc>
@@ -3510,7 +3519,7 @@
               <w:rPr>
                 <w:sz w:val="18"/>
               </w:rPr>
-              <w:t>1 : 107 000 000</w:t>
+              <w:t>1 : 110 000 000</w:t>
             </w:r>
           </w:p>
         </w:tc>
@@ -3546,7 +3555,7 @@
               <w:rPr>
                 <w:sz w:val="18"/>
               </w:rPr>
-              <w:t>26,4 cm</w:t>
+              <w:t>26,5 cm</w:t>
             </w:r>
           </w:p>
         </w:tc>
@@ -3563,7 +3572,7 @@
               <w:rPr>
                 <w:sz w:val="18"/>
               </w:rPr>
-              <w:t>37,3 cm</w:t>
+              <w:t>36,2 cm</w:t>
             </w:r>
           </w:p>
         </w:tc>
@@ -3599,7 +3608,7 @@
               <w:rPr>
                 <w:sz w:val="18"/>
               </w:rPr>
-              <w:t>≈ 1,6 cm</w:t>
+              <w:t>≈ 1,7 cm</w:t>
             </w:r>
           </w:p>
         </w:tc>

</xml_diff>

<commit_message>
feat: botón Código R en cada gráfica y mapa en EPSG:4087 para que escala, barra y cuadrícula coincidan
Co-Authored-By: Claude Opus 5.5 <noreply@anthropic.com>
</commit_message>
<xml_diff>
--- a/docs/informe_muestreo.docx
+++ b/docs/informe_muestreo.docx
@@ -3206,6 +3206,36 @@
           <w:b/>
           <w:i w:val="0"/>
         </w:rPr>
+        <w:t xml:space="preserve">Sistema de coordenadas. </w:t>
+      </w:r>
+      <w:r>
+        <w:rPr>
+          <w:b w:val="0"/>
+          <w:i w:val="0"/>
+        </w:rPr>
+        <w:t xml:space="preserve">El mapa está en la proyección </w:t>
+      </w:r>
+      <w:r>
+        <w:rPr>
+          <w:b/>
+          <w:i w:val="0"/>
+        </w:rPr>
+        <w:t>equidistante cilíndrica</w:t>
+      </w:r>
+      <w:r>
+        <w:rPr>
+          <w:b w:val="0"/>
+          <w:i w:val="0"/>
+        </w:rPr>
+        <w:t xml:space="preserve"> (Plate Carrée) sobre el datum WGS84, código EPSG:4087, que trabaja en metros. En ella cada grado mide lo mismo en todo el mapa: 1° = 111,32 km, de modo que 30° = 3 339,6 km tanto a lo ancho como a lo alto. Por eso la escala numérica, la barra en km y la cuadrícula de 30° coinciden. Antes el mapa estaba en grados (EPSG:4326) y QGIS medía la escala con otro valor del grado (110,6 km): la barra y la grilla diferían 0,7 %.</w:t>
+      </w:r>
+    </w:p>
+    <w:p>
+      <w:r>
+        <w:rPr>
+          <w:b/>
+          <w:i w:val="0"/>
+        </w:rPr>
         <w:t xml:space="preserve">Cálculo de la escala. </w:t>
       </w:r>
       <w:r>
@@ -3213,7 +3243,7 @@
           <w:b w:val="0"/>
           <w:i w:val="0"/>
         </w:rPr>
-        <w:t>Escala = distancia en el papel / distancia real. Aquí se hizo al revés: se eligió una escala redonda y se calculó cuánto debe medir el marco del mapa para que los 360° de longitud entren a esa escala. QGIS mide la escala con la longitud de un grado de latitud (unos 110,6 km), así que 360° equivalen a unos 39 810 km = 39 810 000 000 mm:</w:t>
+        <w:t>Escala = distancia en el papel / distancia real. Se eligió una escala redonda y se calculó cuánto debe medir el marco para que los 360° del ecuador (40 075 km = 40 075 000 000 mm) entren a esa escala:</w:t>
       </w:r>
     </w:p>
     <w:tbl>
@@ -3240,7 +3270,7 @@
                 <w:rFonts w:ascii="Consolas" w:hAnsi="Consolas"/>
                 <w:sz w:val="17"/>
               </w:rPr>
-              <w:t>A4: ancho del marco = 39 810 000 000 mm / 150 000 000 ≈ 265,4 mm   →   1 : 150 000 000</w:t>
+              <w:t>A4: ancho del marco = 40 075 000 000 mm / 150 000 000 = 267,2 mm   →   1 : 150 000 000</w:t>
             </w:r>
           </w:p>
           <w:p>
@@ -3252,7 +3282,19 @@
                 <w:rFonts w:ascii="Consolas" w:hAnsi="Consolas"/>
                 <w:sz w:val="17"/>
               </w:rPr>
-              <w:t>A3: ancho del marco = 39 810 000 000 mm / 110 000 000 ≈ 361,9 mm   →   1 : 110 000 000</w:t>
+              <w:t>A3: ancho del marco = 40 075 000 000 mm / 110 000 000 = 364,3 mm   →   1 : 110 000 000</w:t>
+            </w:r>
+          </w:p>
+          <w:p>
+            <w:pPr>
+              <w:spacing w:after="0" w:line="240" w:lineRule="auto"/>
+            </w:pPr>
+            <w:r>
+              <w:rPr>
+                <w:rFonts w:ascii="Consolas" w:hAnsi="Consolas"/>
+                <w:sz w:val="17"/>
+              </w:rPr>
+              <w:t>Comprobación A4: 30° = 3 339 600 000 mm / 150 000 000 = 22,3 mm entre líneas de la cuadrícula</w:t>
             </w:r>
           </w:p>
         </w:tc>
@@ -3269,30 +3311,7 @@
           <w:b w:val="0"/>
           <w:i w:val="0"/>
         </w:rPr>
-        <w:t>¿Por qué no 1 : 100 000 000 en A3? Porque el marco mediría unos 40 cm en una hoja de 42 cm y no quedaría lugar para el borde ni las coordenadas. Sobre el ecuador el grado de longitud mide un poco más (111,3 km), así que allí la escala real es 0,7 % menor (1 : 151 000 000 en A4); con una regla no se nota.</w:t>
-      </w:r>
-    </w:p>
-    <w:p>
-      <w:r>
-        <w:rPr>
-          <w:b w:val="0"/>
-          <w:i w:val="0"/>
-        </w:rPr>
-        <w:t xml:space="preserve">Es una escala </w:t>
-      </w:r>
-      <w:r>
-        <w:rPr>
-          <w:b/>
-          <w:i w:val="0"/>
-        </w:rPr>
-        <w:t>válida sobre el ecuador</w:t>
-      </w:r>
-      <w:r>
-        <w:rPr>
-          <w:b w:val="0"/>
-          <w:i w:val="0"/>
-        </w:rPr>
-        <w:t>: en un mapa mundial las distancias se deforman hacia los polos, por eso el membrete y la escala gráfica lo aclaran.</w:t>
+        <w:t>¿Por qué no 1 : 100 000 000 en A3? Porque el marco mediría 40,1 cm en una hoja de 42 cm y no quedaría lugar para el borde ni las coordenadas. La escala es exacta sobre el ecuador y a lo largo de los meridianos; en sentido este–oeste, lejos del ecuador, el mapa estira las distancias (a 60° de latitud, el doble), como todo mapa del mundo entero en una hoja plana.</w:t>
       </w:r>
     </w:p>
     <w:tbl>
@@ -3555,7 +3574,7 @@
               <w:rPr>
                 <w:sz w:val="18"/>
               </w:rPr>
-              <w:t>26,5 cm</w:t>
+              <w:t>26,7 cm</w:t>
             </w:r>
           </w:p>
         </w:tc>
@@ -3572,7 +3591,7 @@
               <w:rPr>
                 <w:sz w:val="18"/>
               </w:rPr>
-              <w:t>36,2 cm</w:t>
+              <w:t>36,4 cm</w:t>
             </w:r>
           </w:p>
         </w:tc>
@@ -3608,7 +3627,7 @@
               <w:rPr>
                 <w:sz w:val="18"/>
               </w:rPr>
-              <w:t>≈ 1,7 cm</w:t>
+              <w:t>1,67 cm</w:t>
             </w:r>
           </w:p>
         </w:tc>
@@ -3625,7 +3644,60 @@
               <w:rPr>
                 <w:sz w:val="18"/>
               </w:rPr>
-              <w:t>≈ 2,3 cm</w:t>
+              <w:t>2,27 cm</w:t>
+            </w:r>
+          </w:p>
+        </w:tc>
+      </w:tr>
+      <w:tr>
+        <w:tc>
+          <w:tcPr>
+            <w:tcW w:type="dxa" w:w="3402"/>
+          </w:tcPr>
+          <w:p>
+            <w:pPr>
+              <w:spacing w:after="0"/>
+            </w:pPr>
+            <w:r/>
+            <w:r>
+              <w:rPr>
+                <w:sz w:val="18"/>
+              </w:rPr>
+              <w:t>Separación de la cuadrícula (30°)</w:t>
+            </w:r>
+          </w:p>
+        </w:tc>
+        <w:tc>
+          <w:tcPr>
+            <w:tcW w:type="dxa" w:w="2835"/>
+          </w:tcPr>
+          <w:p>
+            <w:pPr>
+              <w:spacing w:after="0"/>
+            </w:pPr>
+            <w:r/>
+            <w:r>
+              <w:rPr>
+                <w:sz w:val="18"/>
+              </w:rPr>
+              <w:t>2,23 cm</w:t>
+            </w:r>
+          </w:p>
+        </w:tc>
+        <w:tc>
+          <w:tcPr>
+            <w:tcW w:type="dxa" w:w="2835"/>
+          </w:tcPr>
+          <w:p>
+            <w:pPr>
+              <w:spacing w:after="0"/>
+            </w:pPr>
+            <w:r/>
+            <w:r>
+              <w:rPr>
+                <w:sz w:val="18"/>
+              </w:rPr>
+              <w:t>3,04 cm</w:t>
             </w:r>
           </w:p>
         </w:tc>

</xml_diff>

<commit_message>
fix: mapa con cuadrícula y coordenadas en metros (EPSG:4087), sin mezclar grados
Co-Authored-By: Claude Opus 5.5 <noreply@anthropic.com>
</commit_message>
<xml_diff>
--- a/docs/informe_muestreo.docx
+++ b/docs/informe_muestreo.docx
@@ -3227,7 +3227,21 @@
           <w:b w:val="0"/>
           <w:i w:val="0"/>
         </w:rPr>
-        <w:t xml:space="preserve"> (Plate Carrée) sobre el datum WGS84, código EPSG:4087, que trabaja en metros. En ella cada grado mide lo mismo en todo el mapa: 1° = 111,32 km, de modo que 30° = 3 339,6 km tanto a lo ancho como a lo alto. Por eso la escala numérica, la barra en km y la cuadrícula de 30° coinciden. Antes el mapa estaba en grados (EPSG:4326) y QGIS medía la escala con otro valor del grado (110,6 km): la barra y la grilla diferían 0,7 %.</w:t>
+        <w:t xml:space="preserve"> (Plate Carrée) sobre el datum WGS84, código EPSG:4087, que trabaja en metros. En ella cada grado mide lo mismo en todo el mapa (1° = 111,32 km). Las coordenadas del borde y la cuadrícula están en </w:t>
+      </w:r>
+      <w:r>
+        <w:rPr>
+          <w:b/>
+          <w:i w:val="0"/>
+        </w:rPr>
+        <w:t>metros</w:t>
+      </w:r>
+      <w:r>
+        <w:rPr>
+          <w:b w:val="0"/>
+          <w:i w:val="0"/>
+        </w:rPr>
+        <w:t xml:space="preserve"> del mismo sistema, cada 2 500 000 m, igual que en la plantilla UTM del curso: así la escala numérica, la barra en km y la cuadrícula usan la misma unidad y coinciden (cada cuadro de la cuadrícula mide lo mismo que un tramo de la barra). Antes el mapa estaba en grados (EPSG:4326) y QGIS medía la escala con otro valor del grado (110,6 km): la barra y la grilla diferían 0,7 %.</w:t>
       </w:r>
     </w:p>
     <w:p>
@@ -3294,7 +3308,7 @@
                 <w:rFonts w:ascii="Consolas" w:hAnsi="Consolas"/>
                 <w:sz w:val="17"/>
               </w:rPr>
-              <w:t>Comprobación A4: 30° = 3 339 600 000 mm / 150 000 000 = 22,3 mm entre líneas de la cuadrícula</w:t>
+              <w:t>Comprobación A4: 2 500 km = 2 500 000 000 mm / 150 000 000 = 16,7 mm entre líneas de la cuadrícula</w:t>
             </w:r>
           </w:p>
         </w:tc>
@@ -3663,7 +3677,7 @@
               <w:rPr>
                 <w:sz w:val="18"/>
               </w:rPr>
-              <w:t>Separación de la cuadrícula (30°)</w:t>
+              <w:t>Separación de la cuadrícula (2 500 000 m)</w:t>
             </w:r>
           </w:p>
         </w:tc>
@@ -3680,7 +3694,7 @@
               <w:rPr>
                 <w:sz w:val="18"/>
               </w:rPr>
-              <w:t>2,23 cm</w:t>
+              <w:t>1,67 cm</w:t>
             </w:r>
           </w:p>
         </w:tc>
@@ -3697,7 +3711,7 @@
               <w:rPr>
                 <w:sz w:val="18"/>
               </w:rPr>
-              <w:t>3,04 cm</w:t>
+              <w:t>2,27 cm</w:t>
             </w:r>
           </w:p>
         </w:tc>

</xml_diff>